<commit_message>
court(moctappwd): amicus-brief latex and petition-for-writ docx gated with the model's per-folder biases: latex_bias 0.02 (0.015-0.03 break all 579 lines as typst; the face's 0.05 fit "men" on p14 line 13) and docx_bias 0.05 (0.05-0.1 break all 474 lines and 17 pages as typst; Word had fit "signatures." p3 and "deadline" p10); cross_engine: gate on every engine, tier 1 0 failed (fb-595.54.70)
Co-Authored-By: Claude Opus 5.5 <noreply@anthropic.com>
</commit_message>
<xml_diff>
--- a/courts/eighth-circuit/missouri/state/court-of-appeals-western-district/petition-for-writ/usage/OUTPUT-petition-for-writ.docx
+++ b/courts/eighth-circuit/missouri/state/court-of-appeals-western-district/petition-for-writ/usage/OUTPUT-petition-for-writ.docx
@@ -121,7 +121,7 @@
     </w:p>
     <w:tbl>
       <w:tblPr>
-        <w:tblW w:w="9360" w:type="dxa"/>
+        <w:tblW w:w="9359" w:type="dxa"/>
         <w:tblLayout w:type="fixed"/>
         <w:tblCellMar>
           <w:top w:w="0" w:type="dxa"/>
@@ -133,7 +133,7 @@
       </w:tblPr>
       <w:tblGrid>
         <w:gridCol w:w="4464"/>
-        <w:gridCol w:w="4896"/>
+        <w:gridCol w:w="4895"/>
       </w:tblGrid>
       <w:tr>
         <w:trPr>
@@ -380,7 +380,7 @@
         </w:tc>
         <w:tc>
           <w:tcPr>
-            <w:tcW w:w="4896" w:type="dxa"/>
+            <w:tcW w:w="4895" w:type="dxa"/>
             <w:tcMar>
               <w:left w:w="864" w:type="dxa"/>
             </w:tcMar>
@@ -4577,7 +4577,7 @@
     </w:p>
     <w:tbl>
       <w:tblPr>
-        <w:tblW w:w="9360" w:type="dxa"/>
+        <w:tblW w:w="9359" w:type="dxa"/>
         <w:tblLayout w:type="fixed"/>
         <w:tblCellMar>
           <w:top w:w="0" w:type="dxa"/>
@@ -4588,7 +4588,7 @@
         <w:tblLook w:val="0000" w:firstRow="0" w:lastRow="0" w:firstColumn="0" w:lastColumn="0" w:noHBand="0" w:noVBand="0"/>
       </w:tblPr>
       <w:tblGrid>
-        <w:gridCol w:w="9360"/>
+        <w:gridCol w:w="9359"/>
       </w:tblGrid>
       <w:tr>
         <w:trPr>
@@ -4596,7 +4596,7 @@
         </w:trPr>
         <w:tc>
           <w:tcPr>
-            <w:tcW w:w="9360" w:type="dxa"/>
+            <w:tcW w:w="9359" w:type="dxa"/>
           </w:tcPr>
           <w:p>
             <w:pPr>
@@ -4992,7 +4992,7 @@
     <w:sectPr>
       <w:footerReference w:type="default" r:id="rIdFooter1"/>
       <w:pgSz w:w="12240" w:h="15840"/>
-      <w:pgMar w:top="1440" w:right="1440" w:bottom="1440" w:left="1440" w:header="720" w:footer="709" w:gutter="0"/>
+      <w:pgMar w:top="1440" w:right="1441" w:bottom="1440" w:left="1440" w:header="720" w:footer="709" w:gutter="0"/>
     </w:sectPr>
   </w:body>
 </w:document>

</xml_diff>